<commit_message>
Preserve OCR document layout in Word comparisons
</commit_message>
<xml_diff>
--- a/DocumentCompare-QuickGuide.docx
+++ b/DocumentCompare-QuickGuide.docx
@@ -652,7 +652,7 @@
     </w:p>
     <w:p>
       <w:r>
-        <w:t>For a PDF with selectable text, leave OCR off. For scanned PDF pages, select the local OCR option and review the recognised text: layout, tables and reading order may change. Pages with no recognised words block an incomplete result.</w:t>
+        <w:t>For selectable-text PDFs, leave OCR off. Scan mode reconstructs page sizes, text sizes, indents and spacing where possible. Review against the PDF: fonts, complex columns, tables and graphics may differ. Pages with no recognised words block an incomplete result.</w:t>
       </w:r>
     </w:p>
     <w:p>
@@ -1095,7 +1095,7 @@
       <w:rPr>
         <w:sz w:val="16"/>
       </w:rPr>
-      <w:t xml:space="preserve">RWS  |  User quick guide  |  v1.0.20  •  </w:t>
+      <w:t xml:space="preserve">RWS  |  User quick guide  |  v1.0.21  •  </w:t>
     </w:r>
     <w:fldSimple w:instr="PAGE"/>
     <w:r>

</xml_diff>